<commit_message>
Align opis DOCX with GOST R 7.0.97-2025: requisites order, margins, page number 10 mm from top, QR placeholder
Co-authored-by: arena-agent <297053741+arena-agent@users.noreply.github.com>
</commit_message>
<xml_diff>
--- a/docs/opis_boepripasy.docx
+++ b/docs/opis_boepripasy.docx
@@ -5,23 +5,7 @@
     <w:p>
       <w:pPr>
         <w:keepNext w:val="0"/>
-        <w:spacing w:before="0" w:after="40" w:line="240" w:lineRule="auto"/>
-        <w:jc w:val="center"/>
-      </w:pPr>
-      <w:r>
-        <w:rPr>
-          <w:rFonts w:ascii="Times New Roman" w:hAnsi="Times New Roman"/>
-          <w:b/>
-          <w:i w:val="0"/>
-          <w:sz w:val="32"/>
-        </w:rPr>
-        <w:t>ОПИСЬ</w:t>
-      </w:r>
-    </w:p>
-    <w:p>
-      <w:pPr>
-        <w:keepNext w:val="0"/>
-        <w:spacing w:before="0" w:after="40" w:line="240" w:lineRule="auto"/>
+        <w:spacing w:before="0" w:after="280" w:line="240" w:lineRule="auto"/>
         <w:jc w:val="center"/>
       </w:pPr>
       <w:r>
@@ -31,21 +15,120 @@
           <w:i w:val="0"/>
           <w:sz w:val="28"/>
         </w:rPr>
-        <w:t>№ ______________________</w:t>
+        <w:t>[НАИМЕНОВАНИЕ ОРГАНИЗАЦИИ]</w:t>
       </w:r>
     </w:p>
     <w:p>
       <w:pPr>
         <w:keepNext w:val="0"/>
-        <w:spacing w:before="0" w:after="240" w:line="240" w:lineRule="auto"/>
+        <w:spacing w:before="0" w:after="200" w:line="240" w:lineRule="auto"/>
         <w:jc w:val="center"/>
       </w:pPr>
       <w:r>
         <w:rPr>
           <w:rFonts w:ascii="Times New Roman" w:hAnsi="Times New Roman"/>
-          <w:b w:val="0"/>
-          <w:i/>
-          <w:sz w:val="24"/>
+          <w:b/>
+          <w:i w:val="0"/>
+          <w:sz w:val="28"/>
+        </w:rPr>
+        <w:t>ОПИСЬ</w:t>
+      </w:r>
+    </w:p>
+    <w:tbl>
+      <w:tblPr>
+        <w:tblW w:type="auto" w:w="0"/>
+        <w:jc w:val="center"/>
+        <w:tblLook w:firstColumn="1" w:firstRow="1" w:lastColumn="0" w:lastRow="0" w:noHBand="0" w:noVBand="1" w:val="04A0"/>
+        <w:tblBorders>
+          <w:top w:val="nil"/>
+          <w:left w:val="nil"/>
+          <w:bottom w:val="nil"/>
+          <w:right w:val="nil"/>
+          <w:insideH w:val="nil"/>
+          <w:insideV w:val="nil"/>
+        </w:tblBorders>
+        <w:tblLayout w:type="fixed"/>
+        <w:tblCellMar>
+          <w:top w:w="0" w:type="dxa"/>
+          <w:left w:w="0" w:type="dxa"/>
+          <w:bottom w:w="0" w:type="dxa"/>
+          <w:right w:w="0" w:type="dxa"/>
+        </w:tblCellMar>
+        <w:tblLayout w:type="fixed"/>
+      </w:tblPr>
+      <w:tblGrid>
+        <w:gridCol w:w="5102"/>
+        <w:gridCol w:w="5102"/>
+      </w:tblGrid>
+      <w:tr>
+        <w:tc>
+          <w:tcPr>
+            <w:tcW w:type="dxa" w:w="5102"/>
+            <w:vAlign w:val="center"/>
+          </w:tcPr>
+          <w:p>
+            <w:pPr>
+              <w:spacing w:before="0" w:after="0" w:line="240" w:lineRule="auto"/>
+              <w:jc w:val="left"/>
+            </w:pPr>
+            <w:r/>
+            <w:r>
+              <w:rPr>
+                <w:rFonts w:ascii="Times New Roman" w:hAnsi="Times New Roman"/>
+                <w:b w:val="0"/>
+                <w:i w:val="0"/>
+                <w:sz w:val="28"/>
+              </w:rPr>
+              <w:t>«____» _______________ 20___ г.</w:t>
+            </w:r>
+          </w:p>
+        </w:tc>
+        <w:tc>
+          <w:tcPr>
+            <w:tcW w:type="dxa" w:w="5102"/>
+            <w:vAlign w:val="center"/>
+          </w:tcPr>
+          <w:p>
+            <w:pPr>
+              <w:spacing w:before="0" w:after="0" w:line="240" w:lineRule="auto"/>
+              <w:jc w:val="right"/>
+            </w:pPr>
+            <w:r/>
+            <w:r>
+              <w:rPr>
+                <w:rFonts w:ascii="Times New Roman" w:hAnsi="Times New Roman"/>
+                <w:b w:val="0"/>
+                <w:i w:val="0"/>
+                <w:sz w:val="28"/>
+              </w:rPr>
+              <w:t>№ ______________________</w:t>
+            </w:r>
+          </w:p>
+        </w:tc>
+      </w:tr>
+    </w:tbl>
+    <w:p>
+      <w:pPr>
+        <w:spacing w:before="0" w:after="0" w:line="240" w:lineRule="exact"/>
+      </w:pPr>
+      <w:r>
+        <w:rPr>
+          <w:sz w:val="4"/>
+        </w:rPr>
+      </w:r>
+    </w:p>
+    <w:p>
+      <w:pPr>
+        <w:keepNext w:val="0"/>
+        <w:spacing w:before="0" w:after="280" w:line="240" w:lineRule="auto"/>
+        <w:jc w:val="center"/>
+      </w:pPr>
+      <w:r>
+        <w:rPr>
+          <w:rFonts w:ascii="Times New Roman" w:hAnsi="Times New Roman"/>
+          <w:b/>
+          <w:i w:val="0"/>
+          <w:sz w:val="28"/>
         </w:rPr>
         <w:t>учёта боеприпасов (патронов), подлежащих охране</w:t>
       </w:r>
@@ -73,8 +156,8 @@
         <w:tblLayout w:type="fixed"/>
       </w:tblPr>
       <w:tblGrid>
-        <w:gridCol w:w="4819"/>
-        <w:gridCol w:w="4819"/>
+        <w:gridCol w:w="5102"/>
+        <w:gridCol w:w="5102"/>
       </w:tblGrid>
       <w:tr>
         <w:trPr>
@@ -82,57 +165,7 @@
         </w:trPr>
         <w:tc>
           <w:tcPr>
-            <w:tcW w:type="dxa" w:w="3969"/>
-            <w:vAlign w:val="center"/>
-            <w:shd w:val="clear" w:color="auto" w:fill="F2F2F2"/>
-          </w:tcPr>
-          <w:p>
-            <w:pPr>
-              <w:spacing w:before="0" w:after="0" w:line="240" w:lineRule="auto"/>
-              <w:jc w:val="left"/>
-            </w:pPr>
-            <w:r/>
-            <w:r>
-              <w:rPr>
-                <w:rFonts w:ascii="Times New Roman" w:hAnsi="Times New Roman"/>
-                <w:b/>
-                <w:i w:val="0"/>
-                <w:sz w:val="24"/>
-              </w:rPr>
-              <w:t>Организация</w:t>
-            </w:r>
-          </w:p>
-        </w:tc>
-        <w:tc>
-          <w:tcPr>
-            <w:tcW w:type="dxa" w:w="5669"/>
-            <w:vAlign w:val="center"/>
-          </w:tcPr>
-          <w:p>
-            <w:pPr>
-              <w:spacing w:before="0" w:after="0" w:line="240" w:lineRule="auto"/>
-              <w:jc w:val="left"/>
-            </w:pPr>
-            <w:r/>
-            <w:r>
-              <w:rPr>
-                <w:rFonts w:ascii="Times New Roman" w:hAnsi="Times New Roman"/>
-                <w:b w:val="0"/>
-                <w:i w:val="0"/>
-                <w:sz w:val="24"/>
-              </w:rPr>
-              <w:t>__________________________________________________</w:t>
-            </w:r>
-          </w:p>
-        </w:tc>
-      </w:tr>
-      <w:tr>
-        <w:trPr>
-          <w:cantSplit w:val="true"/>
-        </w:trPr>
-        <w:tc>
-          <w:tcPr>
-            <w:tcW w:type="dxa" w:w="3969"/>
+            <w:tcW w:type="dxa" w:w="4252"/>
             <w:vAlign w:val="center"/>
             <w:shd w:val="clear" w:color="auto" w:fill="F2F2F2"/>
           </w:tcPr>
@@ -155,7 +188,7 @@
         </w:tc>
         <w:tc>
           <w:tcPr>
-            <w:tcW w:type="dxa" w:w="5669"/>
+            <w:tcW w:type="dxa" w:w="5953"/>
             <w:vAlign w:val="center"/>
           </w:tcPr>
           <w:p>
@@ -182,57 +215,7 @@
         </w:trPr>
         <w:tc>
           <w:tcPr>
-            <w:tcW w:type="dxa" w:w="3969"/>
-            <w:vAlign w:val="center"/>
-            <w:shd w:val="clear" w:color="auto" w:fill="F2F2F2"/>
-          </w:tcPr>
-          <w:p>
-            <w:pPr>
-              <w:spacing w:before="0" w:after="0" w:line="240" w:lineRule="auto"/>
-              <w:jc w:val="left"/>
-            </w:pPr>
-            <w:r/>
-            <w:r>
-              <w:rPr>
-                <w:rFonts w:ascii="Times New Roman" w:hAnsi="Times New Roman"/>
-                <w:b/>
-                <w:i w:val="0"/>
-                <w:sz w:val="24"/>
-              </w:rPr>
-              <w:t>Дата составления описи</w:t>
-            </w:r>
-          </w:p>
-        </w:tc>
-        <w:tc>
-          <w:tcPr>
-            <w:tcW w:type="dxa" w:w="5669"/>
-            <w:vAlign w:val="center"/>
-          </w:tcPr>
-          <w:p>
-            <w:pPr>
-              <w:spacing w:before="0" w:after="0" w:line="240" w:lineRule="auto"/>
-              <w:jc w:val="left"/>
-            </w:pPr>
-            <w:r/>
-            <w:r>
-              <w:rPr>
-                <w:rFonts w:ascii="Times New Roman" w:hAnsi="Times New Roman"/>
-                <w:b w:val="0"/>
-                <w:i w:val="0"/>
-                <w:sz w:val="24"/>
-              </w:rPr>
-              <w:t>«____» _______________ 20___ г.</w:t>
-            </w:r>
-          </w:p>
-        </w:tc>
-      </w:tr>
-      <w:tr>
-        <w:trPr>
-          <w:cantSplit w:val="true"/>
-        </w:trPr>
-        <w:tc>
-          <w:tcPr>
-            <w:tcW w:type="dxa" w:w="3969"/>
+            <w:tcW w:type="dxa" w:w="4252"/>
             <w:vAlign w:val="center"/>
             <w:shd w:val="clear" w:color="auto" w:fill="F2F2F2"/>
           </w:tcPr>
@@ -255,7 +238,7 @@
         </w:tc>
         <w:tc>
           <w:tcPr>
-            <w:tcW w:type="dxa" w:w="5669"/>
+            <w:tcW w:type="dxa" w:w="5953"/>
             <w:vAlign w:val="center"/>
           </w:tcPr>
           <w:p>
@@ -290,7 +273,8 @@
     <w:p>
       <w:pPr>
         <w:keepNext/>
-        <w:spacing w:before="120" w:after="120" w:line="240" w:lineRule="auto"/>
+        <w:spacing w:before="120" w:after="160" w:line="240" w:lineRule="auto"/>
+        <w:ind w:firstLine="709"/>
         <w:jc w:val="left"/>
       </w:pPr>
       <w:r>
@@ -298,7 +282,7 @@
           <w:rFonts w:ascii="Times New Roman" w:hAnsi="Times New Roman"/>
           <w:b/>
           <w:i w:val="0"/>
-          <w:sz w:val="24"/>
+          <w:sz w:val="28"/>
         </w:rPr>
         <w:t>1. Сведения о партии</w:t>
       </w:r>
@@ -326,8 +310,8 @@
         <w:tblLayout w:type="fixed"/>
       </w:tblPr>
       <w:tblGrid>
-        <w:gridCol w:w="4819"/>
-        <w:gridCol w:w="4819"/>
+        <w:gridCol w:w="5102"/>
+        <w:gridCol w:w="5102"/>
       </w:tblGrid>
       <w:tr>
         <w:trPr>
@@ -335,7 +319,7 @@
         </w:trPr>
         <w:tc>
           <w:tcPr>
-            <w:tcW w:type="dxa" w:w="3969"/>
+            <w:tcW w:type="dxa" w:w="4252"/>
             <w:vAlign w:val="center"/>
             <w:shd w:val="clear" w:color="auto" w:fill="F2F2F2"/>
           </w:tcPr>
@@ -358,7 +342,7 @@
         </w:tc>
         <w:tc>
           <w:tcPr>
-            <w:tcW w:type="dxa" w:w="5669"/>
+            <w:tcW w:type="dxa" w:w="5953"/>
             <w:vAlign w:val="center"/>
           </w:tcPr>
           <w:p>
@@ -385,7 +369,7 @@
         </w:trPr>
         <w:tc>
           <w:tcPr>
-            <w:tcW w:type="dxa" w:w="3969"/>
+            <w:tcW w:type="dxa" w:w="4252"/>
             <w:vAlign w:val="center"/>
             <w:shd w:val="clear" w:color="auto" w:fill="F2F2F2"/>
           </w:tcPr>
@@ -408,7 +392,7 @@
         </w:tc>
         <w:tc>
           <w:tcPr>
-            <w:tcW w:type="dxa" w:w="5669"/>
+            <w:tcW w:type="dxa" w:w="5953"/>
             <w:vAlign w:val="center"/>
           </w:tcPr>
           <w:p>
@@ -435,7 +419,7 @@
         </w:trPr>
         <w:tc>
           <w:tcPr>
-            <w:tcW w:type="dxa" w:w="3969"/>
+            <w:tcW w:type="dxa" w:w="4252"/>
             <w:vAlign w:val="center"/>
             <w:shd w:val="clear" w:color="auto" w:fill="F2F2F2"/>
           </w:tcPr>
@@ -458,7 +442,7 @@
         </w:tc>
         <w:tc>
           <w:tcPr>
-            <w:tcW w:type="dxa" w:w="5669"/>
+            <w:tcW w:type="dxa" w:w="5953"/>
             <w:vAlign w:val="center"/>
           </w:tcPr>
           <w:p>
@@ -485,7 +469,7 @@
         </w:trPr>
         <w:tc>
           <w:tcPr>
-            <w:tcW w:type="dxa" w:w="3969"/>
+            <w:tcW w:type="dxa" w:w="4252"/>
             <w:vAlign w:val="center"/>
             <w:shd w:val="clear" w:color="auto" w:fill="F2F2F2"/>
           </w:tcPr>
@@ -508,7 +492,7 @@
         </w:tc>
         <w:tc>
           <w:tcPr>
-            <w:tcW w:type="dxa" w:w="5669"/>
+            <w:tcW w:type="dxa" w:w="5953"/>
             <w:vAlign w:val="center"/>
           </w:tcPr>
           <w:p>
@@ -535,7 +519,7 @@
         </w:trPr>
         <w:tc>
           <w:tcPr>
-            <w:tcW w:type="dxa" w:w="3969"/>
+            <w:tcW w:type="dxa" w:w="4252"/>
             <w:vAlign w:val="center"/>
             <w:shd w:val="clear" w:color="auto" w:fill="F2F2F2"/>
           </w:tcPr>
@@ -558,7 +542,7 @@
         </w:tc>
         <w:tc>
           <w:tcPr>
-            <w:tcW w:type="dxa" w:w="5669"/>
+            <w:tcW w:type="dxa" w:w="5953"/>
             <w:vAlign w:val="center"/>
           </w:tcPr>
           <w:p>
@@ -585,7 +569,7 @@
         </w:trPr>
         <w:tc>
           <w:tcPr>
-            <w:tcW w:type="dxa" w:w="3969"/>
+            <w:tcW w:type="dxa" w:w="4252"/>
             <w:vAlign w:val="center"/>
             <w:shd w:val="clear" w:color="auto" w:fill="F2F2F2"/>
           </w:tcPr>
@@ -608,7 +592,7 @@
         </w:tc>
         <w:tc>
           <w:tcPr>
-            <w:tcW w:type="dxa" w:w="5669"/>
+            <w:tcW w:type="dxa" w:w="5953"/>
             <w:vAlign w:val="center"/>
           </w:tcPr>
           <w:p>
@@ -643,7 +627,8 @@
     <w:p>
       <w:pPr>
         <w:keepNext/>
-        <w:spacing w:before="120" w:after="120" w:line="240" w:lineRule="auto"/>
+        <w:spacing w:before="120" w:after="160" w:line="240" w:lineRule="auto"/>
+        <w:ind w:firstLine="709"/>
         <w:jc w:val="left"/>
       </w:pPr>
       <w:r>
@@ -651,7 +636,7 @@
           <w:rFonts w:ascii="Times New Roman" w:hAnsi="Times New Roman"/>
           <w:b/>
           <w:i w:val="0"/>
-          <w:sz w:val="24"/>
+          <w:sz w:val="28"/>
         </w:rPr>
         <w:t>2. Перечень изделий (присвоенные номера)</w:t>
       </w:r>
@@ -667,7 +652,7 @@
           <w:rFonts w:ascii="Times New Roman" w:hAnsi="Times New Roman"/>
           <w:b w:val="0"/>
           <w:i/>
-          <w:sz w:val="20"/>
+          <w:sz w:val="22"/>
         </w:rPr>
         <w:t>Формат присвоенного номера: ПАТ-&lt;партия&gt;-&lt;порядковый номер&gt; (предлагается, уточнить)</w:t>
       </w:r>
@@ -695,12 +680,12 @@
         <w:tblLayout w:type="fixed"/>
       </w:tblPr>
       <w:tblGrid>
-        <w:gridCol w:w="1606"/>
-        <w:gridCol w:w="1606"/>
-        <w:gridCol w:w="1606"/>
-        <w:gridCol w:w="1606"/>
-        <w:gridCol w:w="1606"/>
-        <w:gridCol w:w="1606"/>
+        <w:gridCol w:w="1701"/>
+        <w:gridCol w:w="1701"/>
+        <w:gridCol w:w="1701"/>
+        <w:gridCol w:w="1701"/>
+        <w:gridCol w:w="1701"/>
+        <w:gridCol w:w="1701"/>
       </w:tblGrid>
       <w:tr>
         <w:trPr>
@@ -823,7 +808,7 @@
         </w:tc>
         <w:tc>
           <w:tcPr>
-            <w:tcW w:type="dxa" w:w="1417"/>
+            <w:tcW w:type="dxa" w:w="1984"/>
             <w:vAlign w:val="center"/>
             <w:shd w:val="clear" w:color="auto" w:fill="E7E6E6"/>
           </w:tcPr>
@@ -957,7 +942,7 @@
         </w:tc>
         <w:tc>
           <w:tcPr>
-            <w:tcW w:type="dxa" w:w="1417"/>
+            <w:tcW w:type="dxa" w:w="1984"/>
             <w:vAlign w:val="center"/>
           </w:tcPr>
           <w:p>
@@ -1089,7 +1074,7 @@
         </w:tc>
         <w:tc>
           <w:tcPr>
-            <w:tcW w:type="dxa" w:w="1417"/>
+            <w:tcW w:type="dxa" w:w="1984"/>
             <w:vAlign w:val="center"/>
           </w:tcPr>
           <w:p>
@@ -1221,7 +1206,7 @@
         </w:tc>
         <w:tc>
           <w:tcPr>
-            <w:tcW w:type="dxa" w:w="1417"/>
+            <w:tcW w:type="dxa" w:w="1984"/>
             <w:vAlign w:val="center"/>
           </w:tcPr>
           <w:p>
@@ -1353,7 +1338,7 @@
         </w:tc>
         <w:tc>
           <w:tcPr>
-            <w:tcW w:type="dxa" w:w="1417"/>
+            <w:tcW w:type="dxa" w:w="1984"/>
             <w:vAlign w:val="center"/>
           </w:tcPr>
           <w:p>
@@ -1485,7 +1470,7 @@
         </w:tc>
         <w:tc>
           <w:tcPr>
-            <w:tcW w:type="dxa" w:w="1417"/>
+            <w:tcW w:type="dxa" w:w="1984"/>
             <w:vAlign w:val="center"/>
           </w:tcPr>
           <w:p>
@@ -1617,7 +1602,7 @@
         </w:tc>
         <w:tc>
           <w:tcPr>
-            <w:tcW w:type="dxa" w:w="1417"/>
+            <w:tcW w:type="dxa" w:w="1984"/>
             <w:vAlign w:val="center"/>
           </w:tcPr>
           <w:p>
@@ -1749,7 +1734,7 @@
         </w:tc>
         <w:tc>
           <w:tcPr>
-            <w:tcW w:type="dxa" w:w="1417"/>
+            <w:tcW w:type="dxa" w:w="1984"/>
             <w:vAlign w:val="center"/>
           </w:tcPr>
           <w:p>
@@ -1881,7 +1866,7 @@
         </w:tc>
         <w:tc>
           <w:tcPr>
-            <w:tcW w:type="dxa" w:w="1417"/>
+            <w:tcW w:type="dxa" w:w="1984"/>
             <w:vAlign w:val="center"/>
           </w:tcPr>
           <w:p>
@@ -2013,7 +1998,7 @@
         </w:tc>
         <w:tc>
           <w:tcPr>
-            <w:tcW w:type="dxa" w:w="1417"/>
+            <w:tcW w:type="dxa" w:w="1984"/>
             <w:vAlign w:val="center"/>
           </w:tcPr>
           <w:p>
@@ -2145,7 +2130,7 @@
         </w:tc>
         <w:tc>
           <w:tcPr>
-            <w:tcW w:type="dxa" w:w="1417"/>
+            <w:tcW w:type="dxa" w:w="1984"/>
             <w:vAlign w:val="center"/>
           </w:tcPr>
           <w:p>
@@ -2277,7 +2262,7 @@
         </w:tc>
         <w:tc>
           <w:tcPr>
-            <w:tcW w:type="dxa" w:w="1417"/>
+            <w:tcW w:type="dxa" w:w="1984"/>
             <w:vAlign w:val="center"/>
           </w:tcPr>
           <w:p>
@@ -2409,7 +2394,7 @@
         </w:tc>
         <w:tc>
           <w:tcPr>
-            <w:tcW w:type="dxa" w:w="1417"/>
+            <w:tcW w:type="dxa" w:w="1984"/>
             <w:vAlign w:val="center"/>
           </w:tcPr>
           <w:p>
@@ -2541,7 +2526,7 @@
         </w:tc>
         <w:tc>
           <w:tcPr>
-            <w:tcW w:type="dxa" w:w="1417"/>
+            <w:tcW w:type="dxa" w:w="1984"/>
             <w:vAlign w:val="center"/>
           </w:tcPr>
           <w:p>
@@ -2673,7 +2658,7 @@
         </w:tc>
         <w:tc>
           <w:tcPr>
-            <w:tcW w:type="dxa" w:w="1417"/>
+            <w:tcW w:type="dxa" w:w="1984"/>
             <w:vAlign w:val="center"/>
           </w:tcPr>
           <w:p>
@@ -2805,7 +2790,7 @@
         </w:tc>
         <w:tc>
           <w:tcPr>
-            <w:tcW w:type="dxa" w:w="1417"/>
+            <w:tcW w:type="dxa" w:w="1984"/>
             <w:vAlign w:val="center"/>
           </w:tcPr>
           <w:p>
@@ -2937,7 +2922,7 @@
         </w:tc>
         <w:tc>
           <w:tcPr>
-            <w:tcW w:type="dxa" w:w="1417"/>
+            <w:tcW w:type="dxa" w:w="1984"/>
             <w:vAlign w:val="center"/>
           </w:tcPr>
           <w:p>
@@ -3069,7 +3054,7 @@
         </w:tc>
         <w:tc>
           <w:tcPr>
-            <w:tcW w:type="dxa" w:w="1417"/>
+            <w:tcW w:type="dxa" w:w="1984"/>
             <w:vAlign w:val="center"/>
           </w:tcPr>
           <w:p>
@@ -3201,7 +3186,7 @@
         </w:tc>
         <w:tc>
           <w:tcPr>
-            <w:tcW w:type="dxa" w:w="1417"/>
+            <w:tcW w:type="dxa" w:w="1984"/>
             <w:vAlign w:val="center"/>
           </w:tcPr>
           <w:p>
@@ -3333,7 +3318,7 @@
         </w:tc>
         <w:tc>
           <w:tcPr>
-            <w:tcW w:type="dxa" w:w="1417"/>
+            <w:tcW w:type="dxa" w:w="1984"/>
             <w:vAlign w:val="center"/>
           </w:tcPr>
           <w:p>
@@ -3465,7 +3450,7 @@
         </w:tc>
         <w:tc>
           <w:tcPr>
-            <w:tcW w:type="dxa" w:w="1417"/>
+            <w:tcW w:type="dxa" w:w="1984"/>
             <w:vAlign w:val="center"/>
           </w:tcPr>
           <w:p>
@@ -3597,7 +3582,7 @@
         </w:tc>
         <w:tc>
           <w:tcPr>
-            <w:tcW w:type="dxa" w:w="1417"/>
+            <w:tcW w:type="dxa" w:w="1984"/>
             <w:vAlign w:val="center"/>
           </w:tcPr>
           <w:p>
@@ -3729,7 +3714,7 @@
         </w:tc>
         <w:tc>
           <w:tcPr>
-            <w:tcW w:type="dxa" w:w="1417"/>
+            <w:tcW w:type="dxa" w:w="1984"/>
             <w:vAlign w:val="center"/>
           </w:tcPr>
           <w:p>
@@ -3861,7 +3846,7 @@
         </w:tc>
         <w:tc>
           <w:tcPr>
-            <w:tcW w:type="dxa" w:w="1417"/>
+            <w:tcW w:type="dxa" w:w="1984"/>
             <w:vAlign w:val="center"/>
           </w:tcPr>
           <w:p>
@@ -3993,7 +3978,7 @@
         </w:tc>
         <w:tc>
           <w:tcPr>
-            <w:tcW w:type="dxa" w:w="1417"/>
+            <w:tcW w:type="dxa" w:w="1984"/>
             <w:vAlign w:val="center"/>
           </w:tcPr>
           <w:p>
@@ -4125,7 +4110,7 @@
         </w:tc>
         <w:tc>
           <w:tcPr>
-            <w:tcW w:type="dxa" w:w="1417"/>
+            <w:tcW w:type="dxa" w:w="1984"/>
             <w:vAlign w:val="center"/>
           </w:tcPr>
           <w:p>
@@ -4257,7 +4242,7 @@
         </w:tc>
         <w:tc>
           <w:tcPr>
-            <w:tcW w:type="dxa" w:w="1417"/>
+            <w:tcW w:type="dxa" w:w="1984"/>
             <w:vAlign w:val="center"/>
           </w:tcPr>
           <w:p>
@@ -4389,7 +4374,7 @@
         </w:tc>
         <w:tc>
           <w:tcPr>
-            <w:tcW w:type="dxa" w:w="1417"/>
+            <w:tcW w:type="dxa" w:w="1984"/>
             <w:vAlign w:val="center"/>
           </w:tcPr>
           <w:p>
@@ -4521,7 +4506,7 @@
         </w:tc>
         <w:tc>
           <w:tcPr>
-            <w:tcW w:type="dxa" w:w="1417"/>
+            <w:tcW w:type="dxa" w:w="1984"/>
             <w:vAlign w:val="center"/>
           </w:tcPr>
           <w:p>
@@ -4653,7 +4638,7 @@
         </w:tc>
         <w:tc>
           <w:tcPr>
-            <w:tcW w:type="dxa" w:w="1417"/>
+            <w:tcW w:type="dxa" w:w="1984"/>
             <w:vAlign w:val="center"/>
           </w:tcPr>
           <w:p>
@@ -4785,7 +4770,7 @@
         </w:tc>
         <w:tc>
           <w:tcPr>
-            <w:tcW w:type="dxa" w:w="1417"/>
+            <w:tcW w:type="dxa" w:w="1984"/>
             <w:vAlign w:val="center"/>
           </w:tcPr>
           <w:p>
@@ -4819,7 +4804,8 @@
     <w:p>
       <w:pPr>
         <w:keepNext/>
-        <w:spacing w:before="120" w:after="120" w:line="240" w:lineRule="auto"/>
+        <w:spacing w:before="120" w:after="160" w:line="240" w:lineRule="auto"/>
+        <w:ind w:firstLine="709"/>
         <w:jc w:val="left"/>
       </w:pPr>
       <w:r>
@@ -4827,7 +4813,7 @@
           <w:rFonts w:ascii="Times New Roman" w:hAnsi="Times New Roman"/>
           <w:b/>
           <w:i w:val="0"/>
-          <w:sz w:val="24"/>
+          <w:sz w:val="28"/>
         </w:rPr>
         <w:t>3. Итоги</w:t>
       </w:r>
@@ -4855,8 +4841,8 @@
         <w:tblLayout w:type="fixed"/>
       </w:tblPr>
       <w:tblGrid>
-        <w:gridCol w:w="4819"/>
-        <w:gridCol w:w="4819"/>
+        <w:gridCol w:w="5102"/>
+        <w:gridCol w:w="5102"/>
       </w:tblGrid>
       <w:tr>
         <w:trPr>
@@ -4864,7 +4850,7 @@
         </w:trPr>
         <w:tc>
           <w:tcPr>
-            <w:tcW w:type="dxa" w:w="6803"/>
+            <w:tcW w:type="dxa" w:w="7370"/>
             <w:vAlign w:val="center"/>
             <w:shd w:val="clear" w:color="auto" w:fill="E7E6E6"/>
           </w:tcPr>
@@ -4915,7 +4901,7 @@
         </w:trPr>
         <w:tc>
           <w:tcPr>
-            <w:tcW w:type="dxa" w:w="6803"/>
+            <w:tcW w:type="dxa" w:w="7370"/>
             <w:vAlign w:val="center"/>
             <w:shd w:val="clear" w:color="auto" w:fill="F2F2F2"/>
           </w:tcPr>
@@ -4964,7 +4950,7 @@
         </w:trPr>
         <w:tc>
           <w:tcPr>
-            <w:tcW w:type="dxa" w:w="6803"/>
+            <w:tcW w:type="dxa" w:w="7370"/>
             <w:vAlign w:val="center"/>
             <w:shd w:val="clear" w:color="auto" w:fill="F2F2F2"/>
           </w:tcPr>
@@ -5013,7 +4999,7 @@
         </w:trPr>
         <w:tc>
           <w:tcPr>
-            <w:tcW w:type="dxa" w:w="6803"/>
+            <w:tcW w:type="dxa" w:w="7370"/>
             <w:vAlign w:val="center"/>
             <w:shd w:val="clear" w:color="auto" w:fill="F2F2F2"/>
           </w:tcPr>
@@ -5062,7 +5048,7 @@
         </w:trPr>
         <w:tc>
           <w:tcPr>
-            <w:tcW w:type="dxa" w:w="6803"/>
+            <w:tcW w:type="dxa" w:w="7370"/>
             <w:vAlign w:val="center"/>
             <w:shd w:val="clear" w:color="auto" w:fill="F2F2F2"/>
           </w:tcPr>
@@ -5119,7 +5105,8 @@
     <w:p>
       <w:pPr>
         <w:keepNext/>
-        <w:spacing w:before="120" w:after="120" w:line="240" w:lineRule="auto"/>
+        <w:spacing w:before="120" w:after="160" w:line="240" w:lineRule="auto"/>
+        <w:ind w:firstLine="709"/>
         <w:jc w:val="left"/>
       </w:pPr>
       <w:r>
@@ -5127,7 +5114,7 @@
           <w:rFonts w:ascii="Times New Roman" w:hAnsi="Times New Roman"/>
           <w:b/>
           <w:i w:val="0"/>
-          <w:sz w:val="24"/>
+          <w:sz w:val="28"/>
         </w:rPr>
         <w:t>4. Ответственные лица</w:t>
       </w:r>
@@ -5155,10 +5142,10 @@
         <w:tblLayout w:type="fixed"/>
       </w:tblPr>
       <w:tblGrid>
-        <w:gridCol w:w="2409"/>
-        <w:gridCol w:w="2409"/>
-        <w:gridCol w:w="2409"/>
-        <w:gridCol w:w="2409"/>
+        <w:gridCol w:w="2551"/>
+        <w:gridCol w:w="2551"/>
+        <w:gridCol w:w="2551"/>
+        <w:gridCol w:w="2551"/>
       </w:tblGrid>
       <w:tr>
         <w:trPr>
@@ -5235,7 +5222,7 @@
         </w:tc>
         <w:tc>
           <w:tcPr>
-            <w:tcW w:type="dxa" w:w="1361"/>
+            <w:tcW w:type="dxa" w:w="1928"/>
             <w:vAlign w:val="center"/>
             <w:shd w:val="clear" w:color="auto" w:fill="E7E6E6"/>
           </w:tcPr>
@@ -5329,7 +5316,7 @@
         </w:tc>
         <w:tc>
           <w:tcPr>
-            <w:tcW w:type="dxa" w:w="1361"/>
+            <w:tcW w:type="dxa" w:w="1928"/>
             <w:vAlign w:val="center"/>
           </w:tcPr>
           <w:p>
@@ -5421,7 +5408,7 @@
         </w:tc>
         <w:tc>
           <w:tcPr>
-            <w:tcW w:type="dxa" w:w="1361"/>
+            <w:tcW w:type="dxa" w:w="1928"/>
             <w:vAlign w:val="center"/>
           </w:tcPr>
           <w:p>
@@ -5513,7 +5500,7 @@
         </w:tc>
         <w:tc>
           <w:tcPr>
-            <w:tcW w:type="dxa" w:w="1361"/>
+            <w:tcW w:type="dxa" w:w="1928"/>
             <w:vAlign w:val="center"/>
           </w:tcPr>
           <w:p>
@@ -5548,6 +5535,7 @@
       <w:pPr>
         <w:keepNext w:val="0"/>
         <w:spacing w:before="0" w:after="0" w:line="240" w:lineRule="auto"/>
+        <w:ind w:firstLine="709"/>
         <w:jc w:val="both"/>
       </w:pPr>
       <w:r>
@@ -5555,21 +5543,75 @@
           <w:rFonts w:ascii="Times New Roman" w:hAnsi="Times New Roman"/>
           <w:b w:val="0"/>
           <w:i/>
-          <w:sz w:val="20"/>
+          <w:sz w:val="24"/>
         </w:rPr>
         <w:t>Примечание. Опись оформляется в соответствии с условиями лицензии и требованиями к учёту и хранению боеприпасов, действующими в организации. Номер описи вносится в этикетку (ЭТ).</w:t>
       </w:r>
     </w:p>
     <w:sectPr>
       <w:headerReference w:type="default" r:id="rId9"/>
+      <w:footerReference w:type="first" r:id="rId10"/>
       <w:pgSz w:w="11906" w:h="16838"/>
-      <w:pgMar w:top="1134" w:right="567" w:bottom="1134" w:left="1701" w:header="567" w:footer="567" w:gutter="0"/>
+      <w:pgMar w:top="1134" w:right="567" w:bottom="1134" w:left="1134" w:header="567" w:footer="283" w:gutter="0"/>
       <w:cols w:space="720"/>
       <w:titlePg/>
       <w:docGrid w:linePitch="360"/>
     </w:sectPr>
   </w:body>
 </w:document>
+</file>
+
+<file path=word/footer1.xml><?xml version="1.0" encoding="utf-8"?>
+<w:ftr xmlns:m="http://schemas.openxmlformats.org/officeDocument/2006/math" xmlns:mc="http://schemas.openxmlformats.org/markup-compatibility/2006" xmlns:mo="http://schemas.microsoft.com/office/mac/office/2008/main" xmlns:mv="urn:schemas-microsoft-com:mac:vml" xmlns:o="urn:schemas-microsoft-com:office:office" xmlns:r="http://schemas.openxmlformats.org/officeDocument/2006/relationships" xmlns:v="urn:schemas-microsoft-com:vml" xmlns:w10="urn:schemas-microsoft-com:office:word" xmlns:w14="http://schemas.microsoft.com/office/word/2010/wordml" xmlns:w="http://schemas.openxmlformats.org/wordprocessingml/2006/main" xmlns:wne="http://schemas.microsoft.com/office/word/2006/wordml" xmlns:wp14="http://schemas.microsoft.com/office/word/2010/wordprocessingDrawing" xmlns:wp="http://schemas.openxmlformats.org/drawingml/2006/wordprocessingDrawing" xmlns:wpc="http://schemas.microsoft.com/office/word/2010/wordprocessingCanvas" xmlns:wpg="http://schemas.microsoft.com/office/word/2010/wordprocessingGroup" xmlns:wpi="http://schemas.microsoft.com/office/word/2010/wordprocessingInk" xmlns:wps="http://schemas.microsoft.com/office/word/2010/wordprocessingShape" mc:Ignorable="w14 wp14">
+  <w:tbl>
+    <w:tblPr>
+      <w:tblW w:type="auto" w:w="0"/>
+      <w:jc w:val="right"/>
+      <w:tblLayout w:type="fixed"/>
+      <w:tblLook w:firstColumn="1" w:firstRow="1" w:lastColumn="0" w:lastRow="0" w:noHBand="0" w:noVBand="1" w:val="04A0"/>
+      <w:tblBorders>
+        <w:top w:val="single" w:sz="6" w:space="0" w:color="000000"/>
+        <w:left w:val="single" w:sz="6" w:space="0" w:color="000000"/>
+        <w:bottom w:val="single" w:sz="6" w:space="0" w:color="000000"/>
+        <w:right w:val="single" w:sz="6" w:space="0" w:color="000000"/>
+      </w:tblBorders>
+    </w:tblPr>
+    <w:tblGrid>
+      <w:gridCol w:w="1417"/>
+    </w:tblGrid>
+    <w:tr>
+      <w:trPr>
+        <w:trHeight w:val="1417" w:hRule="exact"/>
+      </w:trPr>
+      <w:tc>
+        <w:tcPr>
+          <w:tcW w:type="dxa" w:w="1417"/>
+          <w:vAlign w:val="center"/>
+        </w:tcPr>
+        <w:p>
+          <w:pPr>
+            <w:jc w:val="center"/>
+          </w:pPr>
+          <w:r/>
+          <w:r>
+            <w:rPr>
+              <w:rFonts w:ascii="Times New Roman" w:hAnsi="Times New Roman"/>
+              <w:sz w:val="16"/>
+            </w:rPr>
+            <w:t>QR-код</w:t>
+            <w:br/>
+            <w:t>документа</w:t>
+          </w:r>
+        </w:p>
+      </w:tc>
+    </w:tr>
+  </w:tbl>
+  <w:p>
+    <w:pPr>
+      <w:spacing w:after="0" w:line="20" w:lineRule="exact"/>
+    </w:pPr>
+  </w:p>
+</w:ftr>
 </file>
 
 <file path=word/header1.xml><?xml version="1.0" encoding="utf-8"?>
@@ -5582,7 +5624,7 @@
     <w:r>
       <w:rPr>
         <w:rFonts w:ascii="Times New Roman" w:hAnsi="Times New Roman"/>
-        <w:sz w:val="24"/>
+        <w:sz w:val="28"/>
       </w:rPr>
       <w:fldChar w:fldCharType="begin"/>
       <w:instrText xml:space="preserve">PAGE</w:instrText>
@@ -5962,7 +6004,7 @@
     </w:pPr>
     <w:rPr>
       <w:rFonts w:ascii="Times New Roman" w:hAnsi="Times New Roman" w:eastAsia="Times New Roman" w:cs="Times New Roman"/>
-      <w:sz w:val="24"/>
+      <w:sz w:val="28"/>
     </w:rPr>
   </w:style>
   <w:style w:type="paragraph" w:styleId="Header">

</xml_diff>